<commit_message>
Emphasize technical project highlights
</commit_message>
<xml_diff>
--- a/public/Yanbao-Li-Resume.docx
+++ b/public/Yanbao-Li-Resume.docx
@@ -111,7 +111,7 @@
           <w:color w:val="141414"/>
           <w:sz w:val="18"/>
         </w:rPr>
-        <w:t>Built a Windows desktop workflow for authorized video-page links with playlist handling, progress tracking, duplicate protection, and task recovery.</w:t>
+        <w:t>Engineered a C# / Windows Forms desktop workflow around yt-dlp and FFmpeg for authorized video-page links, playlist jobs, progress tracking, and task recovery.</w:t>
       </w:r>
     </w:p>
     <w:p>
@@ -132,7 +132,7 @@
           <w:color w:val="141414"/>
           <w:sz w:val="18"/>
         </w:rPr>
-        <w:t>Designed a local-first experience that turns multi-step downloads into a clear, recoverable user workflow.</w:t>
+        <w:t>Implemented local duplicate protection and recoverable task state to make multi-step media processing reliable for end users.</w:t>
       </w:r>
     </w:p>
     <w:p>
@@ -194,7 +194,7 @@
           <w:color w:val="141414"/>
           <w:sz w:val="18"/>
         </w:rPr>
-        <w:t>Built a policy-first decision layer for long-form video advertising by combining time-coded video evidence, player-state signals, and local paused-frame vision.</w:t>
+        <w:t>Built a TypeScript / Fastify decision service that fuses TwelveLabs time-coded video evidence, player-state signals, and MediaPipe paused-frame vision.</w:t>
       </w:r>
     </w:p>
     <w:p>
@@ -215,7 +215,7 @@
           <w:color w:val="141414"/>
           <w:sz w:val="18"/>
         </w:rPr>
-        <w:t>Implemented deterministic ethical rules and explainable decision outputs rather than relying only on opaque model scores.</w:t>
+        <w:t>Designed deterministic policy and ethical-rule layers that produce explainable ad-placement decisions instead of relying only on opaque model scores.</w:t>
       </w:r>
     </w:p>
     <w:p>
@@ -277,7 +277,7 @@
           <w:color w:val="141414"/>
           <w:sz w:val="18"/>
         </w:rPr>
-        <w:t>Built a cross-platform music and MV player for Windows and Android with local import, offline-first playback, playlists, and cloud-sync foundations.</w:t>
+        <w:t>Developed a Flutter / Dart music and MV player for Windows and Android with local import, offline-first playback, playlists, and Supabase sync foundations.</w:t>
       </w:r>
     </w:p>
     <w:p>
@@ -298,7 +298,7 @@
           <w:color w:val="141414"/>
           <w:sz w:val="18"/>
         </w:rPr>
-        <w:t>Implemented SHA-256 duplicate detection and SQLite-based library management for a reliable local media catalog.</w:t>
+        <w:t>Implemented SHA-256 content deduplication and a SQLite-backed media library to keep local catalogs consistent and queryable.</w:t>
       </w:r>
     </w:p>
     <w:p>
@@ -360,7 +360,7 @@
           <w:color w:val="141414"/>
           <w:sz w:val="18"/>
         </w:rPr>
-        <w:t>Led algorithm and model-architecture design for a multimodal image-fusion system and coordinated research writing and experiment design across a four-person team.</w:t>
+        <w:t>Led PyTorch model-architecture and algorithm design for multimodal image fusion, including data integration and experiment planning across a four-person research team.</w:t>
       </w:r>
     </w:p>
     <w:p>
@@ -381,7 +381,7 @@
           <w:color w:val="141414"/>
           <w:sz w:val="18"/>
         </w:rPr>
-        <w:t>Developed and iteratively tuned PyTorch-based fusion models for experimental evaluation.</w:t>
+        <w:t>Iteratively tuned fusion-model behavior and evaluation workflows to support repeatable experimental analysis.</w:t>
       </w:r>
     </w:p>
     <w:p>
@@ -572,7 +572,7 @@
           <w:color w:val="141414"/>
           <w:sz w:val="18"/>
         </w:rPr>
-        <w:t>Technical Skills: Python, Java, C#, TypeScript, Dart, SQL, Git, MySQL, SQLite, Spring Boot, Fastify, Flutter, PyTorch, Windows Forms, FFmpeg</w:t>
+        <w:t>Languages &amp; Data: Python, Java, C#, TypeScript, Dart, SQL, Git, MySQL, SQLite | Frameworks &amp; Tools: Spring Boot, Fastify, Flutter, PyTorch, Windows Forms, yt-dlp, FFmpeg, MediaPipe</w:t>
       </w:r>
     </w:p>
     <w:p>

</xml_diff>

<commit_message>
Highlight modeling and tuning contributions
</commit_message>
<xml_diff>
--- a/public/Yanbao-Li-Resume.docx
+++ b/public/Yanbao-Li-Resume.docx
@@ -111,7 +111,48 @@
           <w:color w:val="141414"/>
           <w:sz w:val="18"/>
         </w:rPr>
-        <w:t>Engineered a C# / Windows Forms desktop workflow around yt-dlp and FFmpeg for authorized video-page links, playlist jobs, progress tracking, and task recovery.</w:t>
+        <w:t>Engineered a C# / Windows Forms workflow around yt-dlp and FFmpeg for authorized video-page links, playlist jobs, progress tracking, duplicate protection, and recoverable task state.</w:t>
+      </w:r>
+    </w:p>
+    <w:p>
+      <w:pPr>
+        <w:tabs>
+          <w:tab w:pos="10008" w:val="left"/>
+        </w:tabs>
+        <w:spacing w:before="60" w:after="0" w:line="240" w:lineRule="auto"/>
+      </w:pPr>
+      <w:r>
+        <w:rPr>
+          <w:rFonts w:ascii="Arial" w:hAnsi="Arial"/>
+          <w:b/>
+          <w:i w:val="0"/>
+          <w:color w:val="141414"/>
+          <w:sz w:val="20"/>
+        </w:rPr>
+        <w:t>AdMind</w:t>
+      </w:r>
+      <w:r>
+        <w:rPr>
+          <w:rFonts w:ascii="Arial" w:hAnsi="Arial"/>
+          <w:b w:val="0"/>
+          <w:i w:val="0"/>
+          <w:color w:val="4E4E4E"/>
+          <w:sz w:val="17"/>
+        </w:rPr>
+        <w:t xml:space="preserve">  |  TypeScript · Fastify · TwelveLabs · MediaPipe</w:t>
+      </w:r>
+      <w:r>
+        <w:tab/>
+      </w:r>
+      <w:r>
+        <w:rPr>
+          <w:rFonts w:ascii="Arial" w:hAnsi="Arial"/>
+          <w:b w:val="0"/>
+          <w:i w:val="0"/>
+          <w:color w:val="4E4E4E"/>
+          <w:sz w:val="18"/>
+        </w:rPr>
+        <w:t>2026</w:t>
       </w:r>
     </w:p>
     <w:p>
@@ -132,7 +173,7 @@
           <w:color w:val="141414"/>
           <w:sz w:val="18"/>
         </w:rPr>
-        <w:t>Implemented local duplicate protection and recoverable task state to make multi-step media processing reliable for end users.</w:t>
+        <w:t>Built a TypeScript / Fastify decision service that fuses TwelveLabs video evidence, player-state signals, and MediaPipe vision with deterministic policy layers for explainable ad-placement decisions.</w:t>
       </w:r>
     </w:p>
     <w:p>
@@ -150,7 +191,7 @@
           <w:color w:val="141414"/>
           <w:sz w:val="20"/>
         </w:rPr>
-        <w:t>AdMind</w:t>
+        <w:t>Sona</w:t>
       </w:r>
       <w:r>
         <w:rPr>
@@ -160,7 +201,7 @@
           <w:color w:val="4E4E4E"/>
           <w:sz w:val="17"/>
         </w:rPr>
-        <w:t xml:space="preserve">  |  TypeScript · Fastify · TwelveLabs · MediaPipe</w:t>
+        <w:t xml:space="preserve">  |  Flutter · Dart · SQLite · Supabase</w:t>
       </w:r>
       <w:r>
         <w:tab/>
@@ -194,7 +235,48 @@
           <w:color w:val="141414"/>
           <w:sz w:val="18"/>
         </w:rPr>
-        <w:t>Built a TypeScript / Fastify decision service that fuses TwelveLabs time-coded video evidence, player-state signals, and MediaPipe paused-frame vision.</w:t>
+        <w:t>Developed a Flutter / Dart media player for Windows and Android with offline-first playback, Supabase sync foundations, SHA-256 content deduplication, and a SQLite-backed library.</w:t>
+      </w:r>
+    </w:p>
+    <w:p>
+      <w:pPr>
+        <w:tabs>
+          <w:tab w:pos="10008" w:val="left"/>
+        </w:tabs>
+        <w:spacing w:before="60" w:after="0" w:line="240" w:lineRule="auto"/>
+      </w:pPr>
+      <w:r>
+        <w:rPr>
+          <w:rFonts w:ascii="Arial" w:hAnsi="Arial"/>
+          <w:b/>
+          <w:i w:val="0"/>
+          <w:color w:val="141414"/>
+          <w:sz w:val="20"/>
+        </w:rPr>
+        <w:t>Multimodal Medical Image Fusion Research</w:t>
+      </w:r>
+      <w:r>
+        <w:rPr>
+          <w:rFonts w:ascii="Arial" w:hAnsi="Arial"/>
+          <w:b w:val="0"/>
+          <w:i w:val="0"/>
+          <w:color w:val="4E4E4E"/>
+          <w:sz w:val="17"/>
+        </w:rPr>
+        <w:t xml:space="preserve">  |  Python · PyTorch · Deep Learning</w:t>
+      </w:r>
+      <w:r>
+        <w:tab/>
+      </w:r>
+      <w:r>
+        <w:rPr>
+          <w:rFonts w:ascii="Arial" w:hAnsi="Arial"/>
+          <w:b w:val="0"/>
+          <w:i w:val="0"/>
+          <w:color w:val="4E4E4E"/>
+          <w:sz w:val="18"/>
+        </w:rPr>
+        <w:t>2024-2025</w:t>
       </w:r>
     </w:p>
     <w:p>
@@ -215,7 +297,7 @@
           <w:color w:val="141414"/>
           <w:sz w:val="18"/>
         </w:rPr>
-        <w:t>Designed deterministic policy and ethical-rule layers that produce explainable ad-placement decisions instead of relying only on opaque model scores.</w:t>
+        <w:t>Implemented and tuned components of a PyTorch-based multimodal image-fusion model, contributing model experiments, parameter adjustment, data integration, and evaluation support.</w:t>
       </w:r>
     </w:p>
     <w:p>
@@ -233,7 +315,7 @@
           <w:color w:val="141414"/>
           <w:sz w:val="20"/>
         </w:rPr>
-        <w:t>Sona</w:t>
+        <w:t>Mathematical Modeling Competitions</w:t>
       </w:r>
       <w:r>
         <w:rPr>
@@ -243,7 +325,7 @@
           <w:color w:val="4E4E4E"/>
           <w:sz w:val="17"/>
         </w:rPr>
-        <w:t xml:space="preserve">  |  Flutter · Dart · SQLite · Supabase</w:t>
+        <w:t xml:space="preserve">  |  Python · Model Fitting · Optimization</w:t>
       </w:r>
       <w:r>
         <w:tab/>
@@ -256,7 +338,7 @@
           <w:color w:val="4E4E4E"/>
           <w:sz w:val="18"/>
         </w:rPr>
-        <w:t>2026</w:t>
+        <w:t>2025</w:t>
       </w:r>
     </w:p>
     <w:p>
@@ -277,111 +359,7 @@
           <w:color w:val="141414"/>
           <w:sz w:val="18"/>
         </w:rPr>
-        <w:t>Developed a Flutter / Dart music and MV player for Windows and Android with local import, offline-first playback, playlists, and Supabase sync foundations.</w:t>
-      </w:r>
-    </w:p>
-    <w:p>
-      <w:pPr>
-        <w:pStyle w:val="16"/>
-        <w:numPr>
-          <w:ilvl w:val="0"/>
-          <w:numId w:val="1"/>
-        </w:numPr>
-        <w:spacing w:before="0" w:after="0" w:line="240" w:lineRule="auto"/>
-        <w:ind w:left="259" w:hanging="173"/>
-      </w:pPr>
-      <w:r>
-        <w:rPr>
-          <w:rFonts w:ascii="Arial" w:hAnsi="Arial"/>
-          <w:b w:val="0"/>
-          <w:i w:val="0"/>
-          <w:color w:val="141414"/>
-          <w:sz w:val="18"/>
-        </w:rPr>
-        <w:t>Implemented SHA-256 content deduplication and a SQLite-backed media library to keep local catalogs consistent and queryable.</w:t>
-      </w:r>
-    </w:p>
-    <w:p>
-      <w:pPr>
-        <w:tabs>
-          <w:tab w:pos="10008" w:val="left"/>
-        </w:tabs>
-        <w:spacing w:before="60" w:after="0" w:line="240" w:lineRule="auto"/>
-      </w:pPr>
-      <w:r>
-        <w:rPr>
-          <w:rFonts w:ascii="Arial" w:hAnsi="Arial"/>
-          <w:b/>
-          <w:i w:val="0"/>
-          <w:color w:val="141414"/>
-          <w:sz w:val="20"/>
-        </w:rPr>
-        <w:t>Multimodal Medical Image Fusion Research</w:t>
-      </w:r>
-      <w:r>
-        <w:rPr>
-          <w:rFonts w:ascii="Arial" w:hAnsi="Arial"/>
-          <w:b w:val="0"/>
-          <w:i w:val="0"/>
-          <w:color w:val="4E4E4E"/>
-          <w:sz w:val="17"/>
-        </w:rPr>
-        <w:t xml:space="preserve">  |  Python · PyTorch · Deep Learning</w:t>
-      </w:r>
-      <w:r>
-        <w:tab/>
-      </w:r>
-      <w:r>
-        <w:rPr>
-          <w:rFonts w:ascii="Arial" w:hAnsi="Arial"/>
-          <w:b w:val="0"/>
-          <w:i w:val="0"/>
-          <w:color w:val="4E4E4E"/>
-          <w:sz w:val="18"/>
-        </w:rPr>
-        <w:t>2024-2025</w:t>
-      </w:r>
-    </w:p>
-    <w:p>
-      <w:pPr>
-        <w:pStyle w:val="16"/>
-        <w:numPr>
-          <w:ilvl w:val="0"/>
-          <w:numId w:val="1"/>
-        </w:numPr>
-        <w:spacing w:before="0" w:after="0" w:line="240" w:lineRule="auto"/>
-        <w:ind w:left="259" w:hanging="173"/>
-      </w:pPr>
-      <w:r>
-        <w:rPr>
-          <w:rFonts w:ascii="Arial" w:hAnsi="Arial"/>
-          <w:b w:val="0"/>
-          <w:i w:val="0"/>
-          <w:color w:val="141414"/>
-          <w:sz w:val="18"/>
-        </w:rPr>
-        <w:t>Led PyTorch model-architecture and algorithm design for multimodal image fusion, including data integration and experiment planning across a four-person research team.</w:t>
-      </w:r>
-    </w:p>
-    <w:p>
-      <w:pPr>
-        <w:pStyle w:val="16"/>
-        <w:numPr>
-          <w:ilvl w:val="0"/>
-          <w:numId w:val="1"/>
-        </w:numPr>
-        <w:spacing w:before="0" w:after="0" w:line="240" w:lineRule="auto"/>
-        <w:ind w:left="259" w:hanging="173"/>
-      </w:pPr>
-      <w:r>
-        <w:rPr>
-          <w:rFonts w:ascii="Arial" w:hAnsi="Arial"/>
-          <w:b w:val="0"/>
-          <w:i w:val="0"/>
-          <w:color w:val="141414"/>
-          <w:sz w:val="18"/>
-        </w:rPr>
-        <w:t>Iteratively tuned fusion-model behavior and evaluation workflows to support repeatable experimental analysis.</w:t>
+        <w:t>Served as primary programmer and modeler: proposed, implemented, and tuned fitting and optimization workflows with random forest, Bayesian optimization, genetic algorithms, island models, and NSGA-II; earned CUMCM Third Prize and ICM recognition.</w:t>
       </w:r>
     </w:p>
     <w:p>

</xml_diff>

<commit_message>
Restore resume style and retain project history
</commit_message>
<xml_diff>
--- a/public/Yanbao-Li-Resume.docx
+++ b/public/Yanbao-Li-Resume.docx
@@ -4,50 +4,63 @@
   <w:body>
     <w:p>
       <w:pPr>
-        <w:spacing w:before="0" w:after="20" w:line="240" w:lineRule="auto"/>
+        <w:spacing w:before="0" w:after="0" w:line="240" w:lineRule="auto"/>
         <w:jc w:val="center"/>
       </w:pPr>
       <w:r>
         <w:rPr>
-          <w:rFonts w:ascii="Arial" w:hAnsi="Arial"/>
+          <w:rFonts w:ascii="Times New Roman" w:hAnsi="Times New Roman"/>
           <w:b/>
           <w:i w:val="0"/>
-          <w:color w:val="142A48"/>
-          <w:sz w:val="40"/>
+          <w:sz w:val="36"/>
         </w:rPr>
         <w:t>Yanbao Li</w:t>
       </w:r>
     </w:p>
     <w:p>
       <w:pPr>
-        <w:spacing w:before="0" w:after="60" w:line="240" w:lineRule="auto"/>
+        <w:spacing w:before="0" w:after="0" w:line="240" w:lineRule="auto"/>
         <w:jc w:val="center"/>
       </w:pPr>
       <w:r>
         <w:rPr>
-          <w:rFonts w:ascii="Arial" w:hAnsi="Arial"/>
-          <w:b w:val="0"/>
-          <w:i w:val="0"/>
-          <w:color w:val="4E4E4E"/>
-          <w:sz w:val="17"/>
-        </w:rPr>
-        <w:t>Stony Brook, NY  |  liyanbao06@outlook.com  |  github.com/Owl-Lee  |  linkedin.com/in/yanbao-li-772a45377  |  yanbaoli.me</w:t>
-      </w:r>
-    </w:p>
-    <w:p>
-      <w:pPr>
-        <w:spacing w:before="120" w:after="60" w:line="240" w:lineRule="auto"/>
+          <w:rFonts w:ascii="Times New Roman" w:hAnsi="Times New Roman"/>
+          <w:b w:val="0"/>
+          <w:i w:val="0"/>
+          <w:sz w:val="20"/>
+        </w:rPr>
+        <w:t>Stony Brook University, Stony Brook, NY</w:t>
+      </w:r>
+    </w:p>
+    <w:p>
+      <w:pPr>
+        <w:spacing w:before="0" w:after="40" w:line="240" w:lineRule="auto"/>
+        <w:jc w:val="center"/>
+      </w:pPr>
+      <w:r>
+        <w:rPr>
+          <w:rFonts w:ascii="Times New Roman" w:hAnsi="Times New Roman"/>
+          <w:b w:val="0"/>
+          <w:i w:val="0"/>
+          <w:sz w:val="20"/>
+        </w:rPr>
+        <w:t>(631) 366-9765 | liyanbao06@outlook.com | github.com/Owl-Lee | yanbaoli.me</w:t>
+      </w:r>
+    </w:p>
+    <w:p>
+      <w:pPr>
+        <w:spacing w:before="160" w:after="60" w:line="240" w:lineRule="auto"/>
+        <w:jc w:val="center"/>
         <w:pBdr>
-          <w:bottom w:val="single" w:sz="10" w:space="3" w:color="163B65"/>
+          <w:bottom w:val="single" w:sz="4" w:space="2" w:color="000000"/>
         </w:pBdr>
       </w:pPr>
       <w:r>
         <w:rPr>
-          <w:rFonts w:ascii="Arial" w:hAnsi="Arial"/>
+          <w:rFonts w:ascii="Times New Roman" w:hAnsi="Times New Roman"/>
           <w:b/>
           <w:i w:val="0"/>
-          <w:color w:val="142A48"/>
-          <w:sz w:val="21"/>
+          <w:sz w:val="24"/>
         </w:rPr>
         <w:t>PROJECTS</w:t>
       </w:r>
@@ -55,42 +68,478 @@
     <w:p>
       <w:pPr>
         <w:tabs>
-          <w:tab w:pos="10008" w:val="left"/>
+          <w:tab w:pos="9288" w:val="left"/>
         </w:tabs>
-        <w:spacing w:before="60" w:after="0" w:line="240" w:lineRule="auto"/>
-      </w:pPr>
-      <w:r>
-        <w:rPr>
-          <w:rFonts w:ascii="Arial" w:hAnsi="Arial"/>
+        <w:spacing w:before="80" w:after="0" w:line="240" w:lineRule="auto"/>
+      </w:pPr>
+      <w:r>
+        <w:rPr>
+          <w:rFonts w:ascii="Times New Roman" w:hAnsi="Times New Roman"/>
           <w:b/>
           <w:i w:val="0"/>
-          <w:color w:val="141414"/>
-          <w:sz w:val="20"/>
+          <w:sz w:val="22"/>
         </w:rPr>
         <w:t>VideoHarvester</w:t>
       </w:r>
       <w:r>
-        <w:rPr>
-          <w:rFonts w:ascii="Arial" w:hAnsi="Arial"/>
-          <w:b w:val="0"/>
-          <w:i w:val="0"/>
-          <w:color w:val="4E4E4E"/>
-          <w:sz w:val="17"/>
-        </w:rPr>
-        <w:t xml:space="preserve">  |  C# · Windows Forms · yt-dlp · FFmpeg</w:t>
-      </w:r>
-      <w:r>
         <w:tab/>
       </w:r>
       <w:r>
         <w:rPr>
-          <w:rFonts w:ascii="Arial" w:hAnsi="Arial"/>
-          <w:b w:val="0"/>
-          <w:i w:val="0"/>
-          <w:color w:val="4E4E4E"/>
-          <w:sz w:val="18"/>
+          <w:rFonts w:ascii="Times New Roman" w:hAnsi="Times New Roman"/>
+          <w:b w:val="0"/>
+          <w:i/>
+          <w:sz w:val="20"/>
         </w:rPr>
         <w:t>2026</w:t>
+      </w:r>
+    </w:p>
+    <w:p>
+      <w:pPr>
+        <w:pStyle w:val="16"/>
+        <w:numPr>
+          <w:ilvl w:val="0"/>
+          <w:numId w:val="1"/>
+        </w:numPr>
+        <w:spacing w:before="0" w:after="0" w:line="252" w:lineRule="auto"/>
+        <w:ind w:left="360" w:hanging="216"/>
+      </w:pPr>
+      <w:r>
+        <w:rPr>
+          <w:rFonts w:ascii="Times New Roman" w:hAnsi="Times New Roman"/>
+          <w:b w:val="0"/>
+          <w:i w:val="0"/>
+          <w:sz w:val="20"/>
+        </w:rPr>
+        <w:t>Built a C# / Windows Forms desktop workflow around yt-dlp and FFmpeg for authorized video-page links, playlist processing, progress tracking, duplicate protection, and recoverable task state.</w:t>
+      </w:r>
+    </w:p>
+    <w:p>
+      <w:pPr>
+        <w:tabs>
+          <w:tab w:pos="9288" w:val="left"/>
+        </w:tabs>
+        <w:spacing w:before="80" w:after="0" w:line="240" w:lineRule="auto"/>
+      </w:pPr>
+      <w:r>
+        <w:rPr>
+          <w:rFonts w:ascii="Times New Roman" w:hAnsi="Times New Roman"/>
+          <w:b/>
+          <w:i w:val="0"/>
+          <w:sz w:val="22"/>
+        </w:rPr>
+        <w:t>AdMind</w:t>
+      </w:r>
+      <w:r>
+        <w:tab/>
+      </w:r>
+      <w:r>
+        <w:rPr>
+          <w:rFonts w:ascii="Times New Roman" w:hAnsi="Times New Roman"/>
+          <w:b w:val="0"/>
+          <w:i/>
+          <w:sz w:val="20"/>
+        </w:rPr>
+        <w:t>2026</w:t>
+      </w:r>
+    </w:p>
+    <w:p>
+      <w:pPr>
+        <w:pStyle w:val="16"/>
+        <w:numPr>
+          <w:ilvl w:val="0"/>
+          <w:numId w:val="1"/>
+        </w:numPr>
+        <w:spacing w:before="0" w:after="0" w:line="252" w:lineRule="auto"/>
+        <w:ind w:left="360" w:hanging="216"/>
+      </w:pPr>
+      <w:r>
+        <w:rPr>
+          <w:rFonts w:ascii="Times New Roman" w:hAnsi="Times New Roman"/>
+          <w:b w:val="0"/>
+          <w:i w:val="0"/>
+          <w:sz w:val="20"/>
+        </w:rPr>
+        <w:t>Built a TypeScript / Fastify decision service that combines TwelveLabs video evidence, player-state signals, MediaPipe paused-frame vision, and deterministic policy rules for explainable ad-placement decisions.</w:t>
+      </w:r>
+    </w:p>
+    <w:p>
+      <w:pPr>
+        <w:tabs>
+          <w:tab w:pos="9288" w:val="left"/>
+        </w:tabs>
+        <w:spacing w:before="80" w:after="0" w:line="240" w:lineRule="auto"/>
+      </w:pPr>
+      <w:r>
+        <w:rPr>
+          <w:rFonts w:ascii="Times New Roman" w:hAnsi="Times New Roman"/>
+          <w:b/>
+          <w:i w:val="0"/>
+          <w:sz w:val="22"/>
+        </w:rPr>
+        <w:t>Sona</w:t>
+      </w:r>
+      <w:r>
+        <w:tab/>
+      </w:r>
+      <w:r>
+        <w:rPr>
+          <w:rFonts w:ascii="Times New Roman" w:hAnsi="Times New Roman"/>
+          <w:b w:val="0"/>
+          <w:i/>
+          <w:sz w:val="20"/>
+        </w:rPr>
+        <w:t>2026</w:t>
+      </w:r>
+    </w:p>
+    <w:p>
+      <w:pPr>
+        <w:pStyle w:val="16"/>
+        <w:numPr>
+          <w:ilvl w:val="0"/>
+          <w:numId w:val="1"/>
+        </w:numPr>
+        <w:spacing w:before="0" w:after="0" w:line="252" w:lineRule="auto"/>
+        <w:ind w:left="360" w:hanging="216"/>
+      </w:pPr>
+      <w:r>
+        <w:rPr>
+          <w:rFonts w:ascii="Times New Roman" w:hAnsi="Times New Roman"/>
+          <w:b w:val="0"/>
+          <w:i w:val="0"/>
+          <w:sz w:val="20"/>
+        </w:rPr>
+        <w:t>Developed a Flutter / Dart music and MV player for Windows and Android with offline-first playback, SHA-256 deduplication, SQLite media-library management, playlists, and Supabase sync foundations.</w:t>
+      </w:r>
+    </w:p>
+    <w:p>
+      <w:pPr>
+        <w:tabs>
+          <w:tab w:pos="9288" w:val="left"/>
+        </w:tabs>
+        <w:spacing w:before="80" w:after="0" w:line="240" w:lineRule="auto"/>
+      </w:pPr>
+      <w:r>
+        <w:rPr>
+          <w:rFonts w:ascii="Times New Roman" w:hAnsi="Times New Roman"/>
+          <w:b/>
+          <w:i w:val="0"/>
+          <w:sz w:val="22"/>
+        </w:rPr>
+        <w:t>Multimodal Medical Image Fusion</w:t>
+      </w:r>
+      <w:r>
+        <w:tab/>
+      </w:r>
+      <w:r>
+        <w:rPr>
+          <w:rFonts w:ascii="Times New Roman" w:hAnsi="Times New Roman"/>
+          <w:b w:val="0"/>
+          <w:i/>
+          <w:sz w:val="20"/>
+        </w:rPr>
+        <w:t>2024-2025</w:t>
+      </w:r>
+    </w:p>
+    <w:p>
+      <w:pPr>
+        <w:pStyle w:val="16"/>
+        <w:numPr>
+          <w:ilvl w:val="0"/>
+          <w:numId w:val="1"/>
+        </w:numPr>
+        <w:spacing w:before="0" w:after="0" w:line="252" w:lineRule="auto"/>
+        <w:ind w:left="360" w:hanging="216"/>
+      </w:pPr>
+      <w:r>
+        <w:rPr>
+          <w:rFonts w:ascii="Times New Roman" w:hAnsi="Times New Roman"/>
+          <w:b w:val="0"/>
+          <w:i w:val="0"/>
+          <w:sz w:val="20"/>
+        </w:rPr>
+        <w:t>Implemented and tuned components of a PyTorch-based multimodal image-fusion model, contributing model experiments, parameter adjustment, data integration, and evaluation support.</w:t>
+      </w:r>
+    </w:p>
+    <w:p>
+      <w:pPr>
+        <w:tabs>
+          <w:tab w:pos="9288" w:val="left"/>
+        </w:tabs>
+        <w:spacing w:before="80" w:after="0" w:line="240" w:lineRule="auto"/>
+      </w:pPr>
+      <w:r>
+        <w:rPr>
+          <w:rFonts w:ascii="Times New Roman" w:hAnsi="Times New Roman"/>
+          <w:b/>
+          <w:i w:val="0"/>
+          <w:sz w:val="22"/>
+        </w:rPr>
+        <w:t>Wave Energy System Optimization</w:t>
+      </w:r>
+      <w:r>
+        <w:tab/>
+      </w:r>
+      <w:r>
+        <w:rPr>
+          <w:rFonts w:ascii="Times New Roman" w:hAnsi="Times New Roman"/>
+          <w:b w:val="0"/>
+          <w:i/>
+          <w:sz w:val="20"/>
+        </w:rPr>
+        <w:t>2025</w:t>
+      </w:r>
+    </w:p>
+    <w:p>
+      <w:pPr>
+        <w:pStyle w:val="16"/>
+        <w:numPr>
+          <w:ilvl w:val="0"/>
+          <w:numId w:val="1"/>
+        </w:numPr>
+        <w:spacing w:before="0" w:after="0" w:line="252" w:lineRule="auto"/>
+        <w:ind w:left="360" w:hanging="216"/>
+      </w:pPr>
+      <w:r>
+        <w:rPr>
+          <w:rFonts w:ascii="Times New Roman" w:hAnsi="Times New Roman"/>
+          <w:b w:val="0"/>
+          <w:i w:val="0"/>
+          <w:sz w:val="20"/>
+        </w:rPr>
+        <w:t>Built Random Forest fitting workflows and implemented genetic-algorithm and Bayesian-optimization parameter tuning to improve prediction accuracy and optimize damping parameters in a modeling competition project.</w:t>
+      </w:r>
+    </w:p>
+    <w:p>
+      <w:pPr>
+        <w:tabs>
+          <w:tab w:pos="9288" w:val="left"/>
+        </w:tabs>
+        <w:spacing w:before="80" w:after="0" w:line="240" w:lineRule="auto"/>
+      </w:pPr>
+      <w:r>
+        <w:rPr>
+          <w:rFonts w:ascii="Times New Roman" w:hAnsi="Times New Roman"/>
+          <w:b/>
+          <w:i w:val="0"/>
+          <w:sz w:val="22"/>
+        </w:rPr>
+        <w:t>CUMCM Drone Optimization</w:t>
+      </w:r>
+      <w:r>
+        <w:tab/>
+      </w:r>
+      <w:r>
+        <w:rPr>
+          <w:rFonts w:ascii="Times New Roman" w:hAnsi="Times New Roman"/>
+          <w:b w:val="0"/>
+          <w:i/>
+          <w:sz w:val="20"/>
+        </w:rPr>
+        <w:t>2025</w:t>
+      </w:r>
+    </w:p>
+    <w:p>
+      <w:pPr>
+        <w:pStyle w:val="16"/>
+        <w:numPr>
+          <w:ilvl w:val="0"/>
+          <w:numId w:val="1"/>
+        </w:numPr>
+        <w:spacing w:before="0" w:after="0" w:line="252" w:lineRule="auto"/>
+        <w:ind w:left="360" w:hanging="216"/>
+      </w:pPr>
+      <w:r>
+        <w:rPr>
+          <w:rFonts w:ascii="Times New Roman" w:hAnsi="Times New Roman"/>
+          <w:b w:val="0"/>
+          <w:i w:val="0"/>
+          <w:sz w:val="20"/>
+        </w:rPr>
+        <w:t>Served as primary programmer and optimization modeler: formulated a geometric model and implemented and tuned simulated annealing, Bayesian optimization, genetic algorithms, island models, and NSGA-II for multi-objective deployment strategies.</w:t>
+      </w:r>
+    </w:p>
+    <w:p>
+      <w:pPr>
+        <w:tabs>
+          <w:tab w:pos="9288" w:val="left"/>
+        </w:tabs>
+        <w:spacing w:before="80" w:after="0" w:line="240" w:lineRule="auto"/>
+      </w:pPr>
+      <w:r>
+        <w:rPr>
+          <w:rFonts w:ascii="Times New Roman" w:hAnsi="Times New Roman"/>
+          <w:b/>
+          <w:i w:val="0"/>
+          <w:sz w:val="22"/>
+        </w:rPr>
+        <w:t>Mathematical Contest in Modeling</w:t>
+      </w:r>
+      <w:r>
+        <w:tab/>
+      </w:r>
+      <w:r>
+        <w:rPr>
+          <w:rFonts w:ascii="Times New Roman" w:hAnsi="Times New Roman"/>
+          <w:b w:val="0"/>
+          <w:i/>
+          <w:sz w:val="20"/>
+        </w:rPr>
+        <w:t>2025</w:t>
+      </w:r>
+    </w:p>
+    <w:p>
+      <w:pPr>
+        <w:pStyle w:val="16"/>
+        <w:numPr>
+          <w:ilvl w:val="0"/>
+          <w:numId w:val="1"/>
+        </w:numPr>
+        <w:spacing w:before="0" w:after="0" w:line="252" w:lineRule="auto"/>
+        <w:ind w:left="360" w:hanging="216"/>
+      </w:pPr>
+      <w:r>
+        <w:rPr>
+          <w:rFonts w:ascii="Times New Roman" w:hAnsi="Times New Roman"/>
+          <w:b w:val="0"/>
+          <w:i w:val="0"/>
+          <w:sz w:val="20"/>
+        </w:rPr>
+        <w:t>Served as primary programmer and modeler, handling Python / MATLAB data cleaning, model fitting, visualization, model selection, and parameter tuning for a three-person team.</w:t>
+      </w:r>
+    </w:p>
+    <w:p>
+      <w:pPr>
+        <w:spacing w:before="160" w:after="60" w:line="240" w:lineRule="auto"/>
+        <w:jc w:val="center"/>
+        <w:pBdr>
+          <w:bottom w:val="single" w:sz="4" w:space="2" w:color="000000"/>
+        </w:pBdr>
+      </w:pPr>
+      <w:r>
+        <w:rPr>
+          <w:rFonts w:ascii="Times New Roman" w:hAnsi="Times New Roman"/>
+          <w:b/>
+          <w:i w:val="0"/>
+          <w:sz w:val="24"/>
+        </w:rPr>
+        <w:t>EDUCATION</w:t>
+      </w:r>
+    </w:p>
+    <w:p>
+      <w:pPr>
+        <w:tabs>
+          <w:tab w:pos="7344" w:val="left"/>
+        </w:tabs>
+        <w:spacing w:before="80" w:after="0" w:line="240" w:lineRule="auto"/>
+      </w:pPr>
+      <w:r>
+        <w:rPr>
+          <w:rFonts w:ascii="Times New Roman" w:hAnsi="Times New Roman"/>
+          <w:b/>
+          <w:i w:val="0"/>
+          <w:sz w:val="22"/>
+        </w:rPr>
+        <w:t>STONY BROOK UNIVERSITY</w:t>
+      </w:r>
+      <w:r>
+        <w:tab/>
+      </w:r>
+      <w:r>
+        <w:rPr>
+          <w:rFonts w:ascii="Times New Roman" w:hAnsi="Times New Roman"/>
+          <w:b w:val="0"/>
+          <w:i w:val="0"/>
+          <w:sz w:val="20"/>
+        </w:rPr>
+        <w:t>Stony Brook, NY</w:t>
+      </w:r>
+    </w:p>
+    <w:p>
+      <w:pPr>
+        <w:tabs>
+          <w:tab w:pos="7344" w:val="left"/>
+        </w:tabs>
+        <w:spacing w:before="0" w:after="0" w:line="240" w:lineRule="auto"/>
+      </w:pPr>
+      <w:r>
+        <w:rPr>
+          <w:rFonts w:ascii="Times New Roman" w:hAnsi="Times New Roman"/>
+          <w:b w:val="0"/>
+          <w:i/>
+          <w:sz w:val="20"/>
+        </w:rPr>
+        <w:t>Bachelor's studies in Information Systems</w:t>
+      </w:r>
+      <w:r>
+        <w:tab/>
+      </w:r>
+      <w:r>
+        <w:rPr>
+          <w:rFonts w:ascii="Times New Roman" w:hAnsi="Times New Roman"/>
+          <w:b w:val="0"/>
+          <w:i/>
+          <w:sz w:val="20"/>
+        </w:rPr>
+        <w:t>Jun 2026 - Present</w:t>
+      </w:r>
+    </w:p>
+    <w:p>
+      <w:pPr>
+        <w:tabs>
+          <w:tab w:pos="7344" w:val="left"/>
+        </w:tabs>
+        <w:spacing w:before="80" w:after="0" w:line="240" w:lineRule="auto"/>
+      </w:pPr>
+      <w:r>
+        <w:rPr>
+          <w:rFonts w:ascii="Times New Roman" w:hAnsi="Times New Roman"/>
+          <w:b/>
+          <w:i w:val="0"/>
+          <w:sz w:val="22"/>
+        </w:rPr>
+        <w:t>ANHUI UNIVERSITY</w:t>
+      </w:r>
+      <w:r>
+        <w:tab/>
+      </w:r>
+      <w:r>
+        <w:rPr>
+          <w:rFonts w:ascii="Times New Roman" w:hAnsi="Times New Roman"/>
+          <w:b w:val="0"/>
+          <w:i w:val="0"/>
+          <w:sz w:val="20"/>
+        </w:rPr>
+        <w:t>Hefei, China</w:t>
+      </w:r>
+    </w:p>
+    <w:p>
+      <w:pPr>
+        <w:tabs>
+          <w:tab w:pos="7344" w:val="left"/>
+        </w:tabs>
+        <w:spacing w:before="0" w:after="0" w:line="240" w:lineRule="auto"/>
+      </w:pPr>
+      <w:r>
+        <w:rPr>
+          <w:rFonts w:ascii="Times New Roman" w:hAnsi="Times New Roman"/>
+          <w:b w:val="0"/>
+          <w:i/>
+          <w:sz w:val="20"/>
+        </w:rPr>
+        <w:t>Bachelor's studies in Digital Media Technology</w:t>
+      </w:r>
+      <w:r>
+        <w:tab/>
+      </w:r>
+      <w:r>
+        <w:rPr>
+          <w:rFonts w:ascii="Times New Roman" w:hAnsi="Times New Roman"/>
+          <w:b w:val="0"/>
+          <w:i/>
+          <w:sz w:val="20"/>
+        </w:rPr>
+        <w:t>Aug 2024 - Jun 2026</w:t>
       </w:r>
     </w:p>
     <w:p>
@@ -101,58 +550,34 @@
           <w:numId w:val="1"/>
         </w:numPr>
         <w:spacing w:before="0" w:after="0" w:line="240" w:lineRule="auto"/>
-        <w:ind w:left="259" w:hanging="173"/>
-      </w:pPr>
-      <w:r>
-        <w:rPr>
-          <w:rFonts w:ascii="Arial" w:hAnsi="Arial"/>
-          <w:b w:val="0"/>
-          <w:i w:val="0"/>
-          <w:color w:val="141414"/>
-          <w:sz w:val="18"/>
-        </w:rPr>
-        <w:t>Engineered a C# / Windows Forms workflow around yt-dlp and FFmpeg for authorized video-page links, playlist jobs, progress tracking, duplicate protection, and recoverable task state.</w:t>
-      </w:r>
-    </w:p>
-    <w:p>
-      <w:pPr>
-        <w:tabs>
-          <w:tab w:pos="10008" w:val="left"/>
-        </w:tabs>
-        <w:spacing w:before="60" w:after="0" w:line="240" w:lineRule="auto"/>
-      </w:pPr>
-      <w:r>
-        <w:rPr>
-          <w:rFonts w:ascii="Arial" w:hAnsi="Arial"/>
+        <w:ind w:left="360" w:hanging="216"/>
+      </w:pPr>
+      <w:r>
+        <w:rPr>
+          <w:rFonts w:ascii="Times New Roman" w:hAnsi="Times New Roman"/>
+          <w:b w:val="0"/>
+          <w:i w:val="0"/>
+          <w:sz w:val="20"/>
+        </w:rPr>
+        <w:t>Co-Lead, Mathematical Modeling Club; Teaching Assistant, Probability Theory</w:t>
+      </w:r>
+    </w:p>
+    <w:p>
+      <w:pPr>
+        <w:spacing w:before="160" w:after="60" w:line="240" w:lineRule="auto"/>
+        <w:jc w:val="center"/>
+        <w:pBdr>
+          <w:bottom w:val="single" w:sz="4" w:space="2" w:color="000000"/>
+        </w:pBdr>
+      </w:pPr>
+      <w:r>
+        <w:rPr>
+          <w:rFonts w:ascii="Times New Roman" w:hAnsi="Times New Roman"/>
           <w:b/>
           <w:i w:val="0"/>
-          <w:color w:val="141414"/>
-          <w:sz w:val="20"/>
-        </w:rPr>
-        <w:t>AdMind</w:t>
-      </w:r>
-      <w:r>
-        <w:rPr>
-          <w:rFonts w:ascii="Arial" w:hAnsi="Arial"/>
-          <w:b w:val="0"/>
-          <w:i w:val="0"/>
-          <w:color w:val="4E4E4E"/>
-          <w:sz w:val="17"/>
-        </w:rPr>
-        <w:t xml:space="preserve">  |  TypeScript · Fastify · TwelveLabs · MediaPipe</w:t>
-      </w:r>
-      <w:r>
-        <w:tab/>
-      </w:r>
-      <w:r>
-        <w:rPr>
-          <w:rFonts w:ascii="Arial" w:hAnsi="Arial"/>
-          <w:b w:val="0"/>
-          <w:i w:val="0"/>
-          <w:color w:val="4E4E4E"/>
-          <w:sz w:val="18"/>
-        </w:rPr>
-        <w:t>2026</w:t>
+          <w:sz w:val="24"/>
+        </w:rPr>
+        <w:t>ADDITIONAL INFORMATION</w:t>
       </w:r>
     </w:p>
     <w:p>
@@ -163,58 +588,16 @@
           <w:numId w:val="1"/>
         </w:numPr>
         <w:spacing w:before="0" w:after="0" w:line="240" w:lineRule="auto"/>
-        <w:ind w:left="259" w:hanging="173"/>
-      </w:pPr>
-      <w:r>
-        <w:rPr>
-          <w:rFonts w:ascii="Arial" w:hAnsi="Arial"/>
-          <w:b w:val="0"/>
-          <w:i w:val="0"/>
-          <w:color w:val="141414"/>
-          <w:sz w:val="18"/>
-        </w:rPr>
-        <w:t>Built a TypeScript / Fastify decision service that fuses TwelveLabs video evidence, player-state signals, and MediaPipe vision with deterministic policy layers for explainable ad-placement decisions.</w:t>
-      </w:r>
-    </w:p>
-    <w:p>
-      <w:pPr>
-        <w:tabs>
-          <w:tab w:pos="10008" w:val="left"/>
-        </w:tabs>
-        <w:spacing w:before="60" w:after="0" w:line="240" w:lineRule="auto"/>
-      </w:pPr>
-      <w:r>
-        <w:rPr>
-          <w:rFonts w:ascii="Arial" w:hAnsi="Arial"/>
-          <w:b/>
-          <w:i w:val="0"/>
-          <w:color w:val="141414"/>
-          <w:sz w:val="20"/>
-        </w:rPr>
-        <w:t>Sona</w:t>
-      </w:r>
-      <w:r>
-        <w:rPr>
-          <w:rFonts w:ascii="Arial" w:hAnsi="Arial"/>
-          <w:b w:val="0"/>
-          <w:i w:val="0"/>
-          <w:color w:val="4E4E4E"/>
-          <w:sz w:val="17"/>
-        </w:rPr>
-        <w:t xml:space="preserve">  |  Flutter · Dart · SQLite · Supabase</w:t>
-      </w:r>
-      <w:r>
-        <w:tab/>
-      </w:r>
-      <w:r>
-        <w:rPr>
-          <w:rFonts w:ascii="Arial" w:hAnsi="Arial"/>
-          <w:b w:val="0"/>
-          <w:i w:val="0"/>
-          <w:color w:val="4E4E4E"/>
-          <w:sz w:val="18"/>
-        </w:rPr>
-        <w:t>2026</w:t>
+        <w:ind w:left="360" w:hanging="216"/>
+      </w:pPr>
+      <w:r>
+        <w:rPr>
+          <w:rFonts w:ascii="Times New Roman" w:hAnsi="Times New Roman"/>
+          <w:b w:val="0"/>
+          <w:i w:val="0"/>
+          <w:sz w:val="20"/>
+        </w:rPr>
+        <w:t>Skills: Python, Java, C#, TypeScript, Dart, SQL, MySQL, SQLite, Spring Boot, Fastify, Flutter, PyTorch, Windows Forms, yt-dlp, FFmpeg, MediaPipe, Git</w:t>
       </w:r>
     </w:p>
     <w:p>
@@ -225,353 +608,21 @@
           <w:numId w:val="1"/>
         </w:numPr>
         <w:spacing w:before="0" w:after="0" w:line="240" w:lineRule="auto"/>
-        <w:ind w:left="259" w:hanging="173"/>
-      </w:pPr>
-      <w:r>
-        <w:rPr>
-          <w:rFonts w:ascii="Arial" w:hAnsi="Arial"/>
-          <w:b w:val="0"/>
-          <w:i w:val="0"/>
-          <w:color w:val="141414"/>
-          <w:sz w:val="18"/>
-        </w:rPr>
-        <w:t>Developed a Flutter / Dart media player for Windows and Android with offline-first playback, Supabase sync foundations, SHA-256 content deduplication, and a SQLite-backed library.</w:t>
-      </w:r>
-    </w:p>
-    <w:p>
-      <w:pPr>
-        <w:tabs>
-          <w:tab w:pos="10008" w:val="left"/>
-        </w:tabs>
-        <w:spacing w:before="60" w:after="0" w:line="240" w:lineRule="auto"/>
-      </w:pPr>
-      <w:r>
-        <w:rPr>
-          <w:rFonts w:ascii="Arial" w:hAnsi="Arial"/>
-          <w:b/>
-          <w:i w:val="0"/>
-          <w:color w:val="141414"/>
-          <w:sz w:val="20"/>
-        </w:rPr>
-        <w:t>Multimodal Medical Image Fusion Research</w:t>
-      </w:r>
-      <w:r>
-        <w:rPr>
-          <w:rFonts w:ascii="Arial" w:hAnsi="Arial"/>
-          <w:b w:val="0"/>
-          <w:i w:val="0"/>
-          <w:color w:val="4E4E4E"/>
-          <w:sz w:val="17"/>
-        </w:rPr>
-        <w:t xml:space="preserve">  |  Python · PyTorch · Deep Learning</w:t>
-      </w:r>
-      <w:r>
-        <w:tab/>
-      </w:r>
-      <w:r>
-        <w:rPr>
-          <w:rFonts w:ascii="Arial" w:hAnsi="Arial"/>
-          <w:b w:val="0"/>
-          <w:i w:val="0"/>
-          <w:color w:val="4E4E4E"/>
-          <w:sz w:val="18"/>
-        </w:rPr>
-        <w:t>2024-2025</w:t>
-      </w:r>
-    </w:p>
-    <w:p>
-      <w:pPr>
-        <w:pStyle w:val="16"/>
-        <w:numPr>
-          <w:ilvl w:val="0"/>
-          <w:numId w:val="1"/>
-        </w:numPr>
-        <w:spacing w:before="0" w:after="0" w:line="240" w:lineRule="auto"/>
-        <w:ind w:left="259" w:hanging="173"/>
-      </w:pPr>
-      <w:r>
-        <w:rPr>
-          <w:rFonts w:ascii="Arial" w:hAnsi="Arial"/>
-          <w:b w:val="0"/>
-          <w:i w:val="0"/>
-          <w:color w:val="141414"/>
-          <w:sz w:val="18"/>
-        </w:rPr>
-        <w:t>Implemented and tuned components of a PyTorch-based multimodal image-fusion model, contributing model experiments, parameter adjustment, data integration, and evaluation support.</w:t>
-      </w:r>
-    </w:p>
-    <w:p>
-      <w:pPr>
-        <w:tabs>
-          <w:tab w:pos="10008" w:val="left"/>
-        </w:tabs>
-        <w:spacing w:before="60" w:after="0" w:line="240" w:lineRule="auto"/>
-      </w:pPr>
-      <w:r>
-        <w:rPr>
-          <w:rFonts w:ascii="Arial" w:hAnsi="Arial"/>
-          <w:b/>
-          <w:i w:val="0"/>
-          <w:color w:val="141414"/>
-          <w:sz w:val="20"/>
-        </w:rPr>
-        <w:t>Mathematical Modeling Competitions</w:t>
-      </w:r>
-      <w:r>
-        <w:rPr>
-          <w:rFonts w:ascii="Arial" w:hAnsi="Arial"/>
-          <w:b w:val="0"/>
-          <w:i w:val="0"/>
-          <w:color w:val="4E4E4E"/>
-          <w:sz w:val="17"/>
-        </w:rPr>
-        <w:t xml:space="preserve">  |  Python · Model Fitting · Optimization</w:t>
-      </w:r>
-      <w:r>
-        <w:tab/>
-      </w:r>
-      <w:r>
-        <w:rPr>
-          <w:rFonts w:ascii="Arial" w:hAnsi="Arial"/>
-          <w:b w:val="0"/>
-          <w:i w:val="0"/>
-          <w:color w:val="4E4E4E"/>
-          <w:sz w:val="18"/>
-        </w:rPr>
-        <w:t>2025</w:t>
-      </w:r>
-    </w:p>
-    <w:p>
-      <w:pPr>
-        <w:pStyle w:val="16"/>
-        <w:numPr>
-          <w:ilvl w:val="0"/>
-          <w:numId w:val="1"/>
-        </w:numPr>
-        <w:spacing w:before="0" w:after="0" w:line="240" w:lineRule="auto"/>
-        <w:ind w:left="259" w:hanging="173"/>
-      </w:pPr>
-      <w:r>
-        <w:rPr>
-          <w:rFonts w:ascii="Arial" w:hAnsi="Arial"/>
-          <w:b w:val="0"/>
-          <w:i w:val="0"/>
-          <w:color w:val="141414"/>
-          <w:sz w:val="18"/>
-        </w:rPr>
-        <w:t>Served as primary programmer and modeler: proposed, implemented, and tuned fitting and optimization workflows with random forest, Bayesian optimization, genetic algorithms, island models, and NSGA-II; earned CUMCM Third Prize and ICM recognition.</w:t>
-      </w:r>
-    </w:p>
-    <w:p>
-      <w:pPr>
-        <w:spacing w:before="120" w:after="60" w:line="240" w:lineRule="auto"/>
-        <w:pBdr>
-          <w:bottom w:val="single" w:sz="10" w:space="3" w:color="163B65"/>
-        </w:pBdr>
-      </w:pPr>
-      <w:r>
-        <w:rPr>
-          <w:rFonts w:ascii="Arial" w:hAnsi="Arial"/>
-          <w:b/>
-          <w:i w:val="0"/>
-          <w:color w:val="142A48"/>
-          <w:sz w:val="21"/>
-        </w:rPr>
-        <w:t>EDUCATION</w:t>
-      </w:r>
-    </w:p>
-    <w:p>
-      <w:pPr>
-        <w:tabs>
-          <w:tab w:pos="10008" w:val="left"/>
-        </w:tabs>
-        <w:spacing w:before="60" w:after="0" w:line="240" w:lineRule="auto"/>
-      </w:pPr>
-      <w:r>
-        <w:rPr>
-          <w:rFonts w:ascii="Arial" w:hAnsi="Arial"/>
-          <w:b/>
-          <w:i w:val="0"/>
-          <w:color w:val="141414"/>
-          <w:sz w:val="20"/>
-        </w:rPr>
-        <w:t>STONY BROOK UNIVERSITY</w:t>
-      </w:r>
-      <w:r>
-        <w:tab/>
-      </w:r>
-      <w:r>
-        <w:rPr>
-          <w:rFonts w:ascii="Arial" w:hAnsi="Arial"/>
-          <w:b w:val="0"/>
-          <w:i w:val="0"/>
-          <w:color w:val="4E4E4E"/>
-          <w:sz w:val="18"/>
-        </w:rPr>
-        <w:t>Stony Brook, NY</w:t>
-      </w:r>
-    </w:p>
-    <w:p>
-      <w:pPr>
-        <w:tabs>
-          <w:tab w:pos="10008" w:val="left"/>
-        </w:tabs>
-        <w:spacing w:before="0" w:after="0" w:line="240" w:lineRule="auto"/>
-      </w:pPr>
-      <w:r>
-        <w:rPr>
-          <w:rFonts w:ascii="Arial" w:hAnsi="Arial"/>
-          <w:b w:val="0"/>
-          <w:i w:val="0"/>
-          <w:color w:val="141414"/>
-          <w:sz w:val="18"/>
-        </w:rPr>
-        <w:t>Bachelor's studies in Information Systems</w:t>
-      </w:r>
-      <w:r>
-        <w:tab/>
-      </w:r>
-      <w:r>
-        <w:rPr>
-          <w:rFonts w:ascii="Arial" w:hAnsi="Arial"/>
-          <w:b w:val="0"/>
-          <w:i w:val="0"/>
-          <w:color w:val="4E4E4E"/>
-          <w:sz w:val="18"/>
-        </w:rPr>
-        <w:t>Jun 2026 - Present</w:t>
-      </w:r>
-    </w:p>
-    <w:p>
-      <w:pPr>
-        <w:tabs>
-          <w:tab w:pos="10008" w:val="left"/>
-        </w:tabs>
-        <w:spacing w:before="60" w:after="0" w:line="240" w:lineRule="auto"/>
-      </w:pPr>
-      <w:r>
-        <w:rPr>
-          <w:rFonts w:ascii="Arial" w:hAnsi="Arial"/>
-          <w:b/>
-          <w:i w:val="0"/>
-          <w:color w:val="141414"/>
-          <w:sz w:val="20"/>
-        </w:rPr>
-        <w:t>ANHUI UNIVERSITY</w:t>
-      </w:r>
-      <w:r>
-        <w:tab/>
-      </w:r>
-      <w:r>
-        <w:rPr>
-          <w:rFonts w:ascii="Arial" w:hAnsi="Arial"/>
-          <w:b w:val="0"/>
-          <w:i w:val="0"/>
-          <w:color w:val="4E4E4E"/>
-          <w:sz w:val="18"/>
-        </w:rPr>
-        <w:t>Hefei, China</w:t>
-      </w:r>
-    </w:p>
-    <w:p>
-      <w:pPr>
-        <w:tabs>
-          <w:tab w:pos="10008" w:val="left"/>
-        </w:tabs>
-        <w:spacing w:before="0" w:after="0" w:line="240" w:lineRule="auto"/>
-      </w:pPr>
-      <w:r>
-        <w:rPr>
-          <w:rFonts w:ascii="Arial" w:hAnsi="Arial"/>
-          <w:b w:val="0"/>
-          <w:i w:val="0"/>
-          <w:color w:val="141414"/>
-          <w:sz w:val="18"/>
-        </w:rPr>
-        <w:t>Bachelor's studies in Digital Media Technology</w:t>
-      </w:r>
-      <w:r>
-        <w:tab/>
-      </w:r>
-      <w:r>
-        <w:rPr>
-          <w:rFonts w:ascii="Arial" w:hAnsi="Arial"/>
-          <w:b w:val="0"/>
-          <w:i w:val="0"/>
-          <w:color w:val="4E4E4E"/>
-          <w:sz w:val="18"/>
-        </w:rPr>
-        <w:t>Aug 2024 - Jun 2026</w:t>
-      </w:r>
-    </w:p>
-    <w:p>
-      <w:pPr>
-        <w:spacing w:before="0" w:after="0" w:line="240" w:lineRule="auto"/>
-      </w:pPr>
-      <w:r>
-        <w:rPr>
-          <w:rFonts w:ascii="Arial" w:hAnsi="Arial"/>
-          <w:b w:val="0"/>
-          <w:i w:val="0"/>
-          <w:color w:val="4E4E4E"/>
-          <w:sz w:val="17"/>
-        </w:rPr>
-        <w:t>Co-Lead, Mathematical Modeling Club; Teaching Assistant, Probability Theory</w:t>
-      </w:r>
-    </w:p>
-    <w:p>
-      <w:pPr>
-        <w:spacing w:before="120" w:after="60" w:line="240" w:lineRule="auto"/>
-        <w:pBdr>
-          <w:bottom w:val="single" w:sz="10" w:space="3" w:color="163B65"/>
-        </w:pBdr>
-      </w:pPr>
-      <w:r>
-        <w:rPr>
-          <w:rFonts w:ascii="Arial" w:hAnsi="Arial"/>
-          <w:b/>
-          <w:i w:val="0"/>
-          <w:color w:val="142A48"/>
-          <w:sz w:val="21"/>
-        </w:rPr>
-        <w:t>ADDITIONAL INFORMATION</w:t>
-      </w:r>
-    </w:p>
-    <w:p>
-      <w:pPr>
-        <w:spacing w:before="0" w:after="0" w:line="240" w:lineRule="auto"/>
-        <w:jc w:val="left"/>
-      </w:pPr>
-      <w:r>
-        <w:rPr>
-          <w:rFonts w:ascii="Arial" w:hAnsi="Arial"/>
-          <w:b w:val="0"/>
-          <w:i w:val="0"/>
-          <w:color w:val="141414"/>
-          <w:sz w:val="18"/>
-        </w:rPr>
-        <w:t>Languages &amp; Data: Python, Java, C#, TypeScript, Dart, SQL, Git, MySQL, SQLite | Frameworks &amp; Tools: Spring Boot, Fastify, Flutter, PyTorch, Windows Forms, yt-dlp, FFmpeg, MediaPipe</w:t>
-      </w:r>
-    </w:p>
-    <w:p>
-      <w:pPr>
-        <w:spacing w:before="0" w:after="0" w:line="240" w:lineRule="auto"/>
-        <w:jc w:val="left"/>
-      </w:pPr>
-      <w:r>
-        <w:rPr>
-          <w:rFonts w:ascii="Arial" w:hAnsi="Arial"/>
-          <w:b w:val="0"/>
-          <w:i w:val="0"/>
-          <w:color w:val="141414"/>
-          <w:sz w:val="18"/>
-        </w:rPr>
-        <w:t>Awards: CUMCM Mathematical Modeling Competition - Third Prize (2025); ICM Mathematical Contest in Modeling - Successful Participant (2025); Innovation &amp; Entrepreneurship Competition - Excellence Award (2025)</w:t>
+        <w:ind w:left="360" w:hanging="216"/>
+      </w:pPr>
+      <w:r>
+        <w:rPr>
+          <w:rFonts w:ascii="Times New Roman" w:hAnsi="Times New Roman"/>
+          <w:b w:val="0"/>
+          <w:i w:val="0"/>
+          <w:sz w:val="20"/>
+        </w:rPr>
+        <w:t>Awards: CUMCM Third Prize (2025); ICM Successful Participant (2025); Innovation &amp; Entrepreneurship Competition Excellence Award (2025)</w:t>
       </w:r>
     </w:p>
     <w:sectPr>
       <w:pgSz w:w="12240" w:h="15840"/>
-      <w:pgMar w:top="648" w:right="864" w:bottom="648" w:left="864" w:header="708" w:footer="708" w:gutter="0"/>
+      <w:pgMar w:top="1008" w:right="864" w:bottom="691" w:left="864" w:header="708" w:footer="708" w:gutter="0"/>
       <w:cols w:space="720" w:num="1"/>
       <w:docGrid w:linePitch="360" w:charSpace="0"/>
     </w:sectPr>

</xml_diff>